<commit_message>
feat: smart claim-aware analysis summary + regenerate manuals
Replace generic verdict text ('Mixed reliability — 1 supported but 1
contradicted') with contextual summaries that reference actual claim
content:

- Shows the specific contradicted claim text in the summary so users
  immediately know WHAT was wrong, not just that 'something' was wrong
- Different headline/tone based on results: 'Looks reliable', 'Some
  facts don't check out', 'Key facts are wrong', 'Could not verify'
- Updated Trust Score description to explain the formula (supported vs
  contradicted, unconfirmed excluded)
- Implemented in extension sidepanel, content overlay, and report page
- Report page summary is fully bilingual (EN + DE)
- Regenerated DOCX manuals with updated content
</commit_message>
<xml_diff>
--- a/docs/KLAR_Benutzerhandbuch_DE.docx
+++ b/docs/KLAR_Benutzerhandbuch_DE.docx
@@ -570,7 +570,7 @@
           <w:rFonts w:ascii="Arial Narrow" w:hAnsi="Arial Narrow"/>
           <w:sz w:val="22"/>
         </w:rPr>
-        <w:t>Stuft jede Behauptung ein als Bestätigt, Widerlegt oder Nicht prüfbar</w:t>
+        <w:t>Stuft jede Behauptung ein als Bestätigt, Widerlegt oder Unbestätigt</w:t>
       </w:r>
     </w:p>
     <w:p>
@@ -679,7 +679,7 @@
           <w:rFonts w:ascii="Arial Narrow" w:hAnsi="Arial Narrow"/>
           <w:sz w:val="22"/>
         </w:rPr>
-        <w:t>Das Ergebnis ist ein umfassender Trust Report mit einer farbcodierten Darstellung Ihres Textes, in der jede Behauptung in Grün (bestätigt), Rot (widerlegt) oder Gelb (nicht prüfbar) markiert ist. Sie können auf jede Behauptung klicken, um die Belege und die Begründung hinter dem Urteil zu sehen.</w:t>
+        <w:t>Das Ergebnis ist ein umfassender Trust Report mit einer farbcodierten Darstellung Ihres Textes, in der jede Behauptung in Grün (bestätigt), Rot (widerlegt) oder Grau (unbestätigt) markiert ist. Sie können auf jede Behauptung klicken, um die Belege und die Begründung hinter dem Urteil zu sehen.</w:t>
       </w:r>
     </w:p>
     <w:p>
@@ -1693,7 +1693,7 @@
       <w:r>
         <w:rPr>
           <w:rFonts w:ascii="Arial Narrow" w:hAnsi="Arial Narrow"/>
-          <w:color w:val="D97706"/>
+          <w:color w:val="64748B"/>
           <w:sz w:val="22"/>
         </w:rPr>
         <w:t xml:space="preserve">● </w:t>
@@ -1703,7 +1703,7 @@
           <w:rFonts w:ascii="Arial Narrow" w:hAnsi="Arial Narrow"/>
           <w:sz w:val="22"/>
         </w:rPr>
-        <w:t>Nicht prüfbar (Gelb) — Keine zuverlässige Quelle konnte gefunden werden</w:t>
+        <w:t>Unbestätigt (Grau) — Keine zuverlässige Quelle konnte gefunden werden. Das bedeutet nicht, dass die Behauptung falsch ist.</w:t>
       </w:r>
     </w:p>
     <w:p>
@@ -2128,7 +2128,7 @@
           <w:rFonts w:ascii="Arial Narrow" w:hAnsi="Arial Narrow"/>
           <w:sz w:val="22"/>
         </w:rPr>
-        <w:t>Trust Score (0–100) für die Gesamtzuverlässigkeit</w:t>
+        <w:t>Trust Score (0–100) basierend auf dem Verhältnis von bestätigten zu widerlegten Behauptungen (unbestätigte Behauptungen werden vom Score ausgeschlossen)</w:t>
       </w:r>
     </w:p>
     <w:p>
@@ -2194,6 +2194,9 @@
           <w:sz w:val="22"/>
         </w:rPr>
         <w:t>Das Dashboard zeigt: Anzahl der Prüfungen, Trust-Score-Trends, aktuelle widerlegte Behauptungen und Schnellzugriff auf letzte Berichte. Die Prüfhistorie ist eine durchsuchbare, sortierbare Liste aller bisherigen Prüfungen.</w:t>
+        <w:br/>
+        <w:br/>
+        <w:t>Hinweis: Der Trust Score misst bestätigte vs. widerlegte Behauptungen. Unbestätigte Behauptungen (ohne Quellen für oder gegen) werden vom Score ausgeschlossen.</w:t>
       </w:r>
     </w:p>
     <w:p>
@@ -3274,7 +3277,7 @@
           <w:rFonts w:ascii="Arial Narrow" w:hAnsi="Arial Narrow"/>
           <w:sz w:val="22"/>
         </w:rPr>
-        <w:t>Ein schwebendes Panel zeigt Trust Score und Behauptungsurteile</w:t>
+        <w:t>Ein schwebendes Panel zeigt Trust Score und Behauptungsurteile. Es werden nur Quellen angezeigt, die die KI tatsächlich referenziert hat.</w:t>
       </w:r>
     </w:p>
     <w:p>
@@ -4727,7 +4730,7 @@
           <w:rFonts w:ascii="Arial Narrow" w:hAnsi="Arial Narrow"/>
           <w:sz w:val="22"/>
         </w:rPr>
-        <w:t>Die Genauigkeit hängt von der Verfügbarkeit der Quellen ab. Behauptungen, die gegen Wikipedia und zuverlässige Webquellen geprüft werden können, erhalten hochgenaue Urteile. Behauptungen über sehr aktuelle Ereignisse oder Nischenthemen können als "Nicht prüfbar" eingestuft werden.</w:t>
+        <w:t>Die Genauigkeit hängt von der Verfügbarkeit der Quellen ab. Behauptungen, die gegen Wikipedia und zuverlässige Webquellen geprüft werden können, erhalten hochgenaue Urteile. Behauptungen über sehr aktuelle Ereignisse oder Nischenthemen können als "Unbestätigt" eingestuft werden. Unbestätigt bedeutet nicht falsch — es bedeutet nur, dass keine Quelle gefunden werden konnte.</w:t>
       </w:r>
     </w:p>
     <w:p>

</xml_diff>